<commit_message>
fix word file bug
</commit_message>
<xml_diff>
--- a/baggage-handling-system/barcode-conveyor/Node-Red Guide.docx
+++ b/baggage-handling-system/barcode-conveyor/Node-Red Guide.docx
@@ -188,7 +188,25 @@
           <w:color w:val="000000" w:themeColor="text1"/>
           <w:lang w:val="en-US"/>
         </w:rPr>
-        <w:t>This will take you to either…</w:t>
+        <w:t xml:space="preserve">This will take you </w:t>
+      </w:r>
+      <w:proofErr w:type="gramStart"/>
+      <w:r>
+        <w:rPr>
+          <w:rFonts w:eastAsiaTheme="minorEastAsia"/>
+          <w:color w:val="000000" w:themeColor="text1"/>
+          <w:lang w:val="en-US"/>
+        </w:rPr>
+        <w:t>to</w:t>
+      </w:r>
+      <w:proofErr w:type="gramEnd"/>
+      <w:r>
+        <w:rPr>
+          <w:rFonts w:eastAsiaTheme="minorEastAsia"/>
+          <w:color w:val="000000" w:themeColor="text1"/>
+          <w:lang w:val="en-US"/>
+        </w:rPr>
+        <w:t xml:space="preserve"> either…</w:t>
       </w:r>
     </w:p>
     <w:p>
@@ -1786,6 +1804,7 @@
               </w:rPr>
               <w:t xml:space="preserve"> </w:t>
             </w:r>
+            <w:proofErr w:type="gramStart"/>
             <w:r>
               <w:rPr>
                 <w:rStyle w:val="normaltextrun"/>
@@ -1795,6 +1814,7 @@
               </w:rPr>
               <w:t>msg.payload</w:t>
             </w:r>
+            <w:proofErr w:type="gramEnd"/>
             <w:r>
               <w:rPr>
                 <w:rFonts w:ascii="Calibri" w:eastAsia="Calibri" w:hAnsi="Calibri" w:cs="Calibri"/>
@@ -2432,7 +2452,23 @@
                 <w:rFonts w:ascii="Calibri" w:eastAsia="Calibri" w:hAnsi="Calibri" w:cs="Calibri"/>
                 <w:lang w:val="en-CA"/>
               </w:rPr>
-              <w:t>Configurable output, typically msg.payload is used.</w:t>
+              <w:t xml:space="preserve">Configurable output, typically </w:t>
+            </w:r>
+            <w:proofErr w:type="gramStart"/>
+            <w:r>
+              <w:rPr>
+                <w:rFonts w:ascii="Calibri" w:eastAsia="Calibri" w:hAnsi="Calibri" w:cs="Calibri"/>
+                <w:lang w:val="en-CA"/>
+              </w:rPr>
+              <w:t>msg.payload</w:t>
+            </w:r>
+            <w:proofErr w:type="gramEnd"/>
+            <w:r>
+              <w:rPr>
+                <w:rFonts w:ascii="Calibri" w:eastAsia="Calibri" w:hAnsi="Calibri" w:cs="Calibri"/>
+                <w:lang w:val="en-CA"/>
+              </w:rPr>
+              <w:t xml:space="preserve"> is used.</w:t>
             </w:r>
           </w:p>
         </w:tc>
@@ -2601,7 +2637,23 @@
                 <w:rFonts w:ascii="Calibri" w:eastAsia="Calibri" w:hAnsi="Calibri" w:cs="Calibri"/>
                 <w:lang w:val="en-CA"/>
               </w:rPr>
-              <w:t>Variable delay is assigned by assigning the msg.delay property using a change node.</w:t>
+              <w:t xml:space="preserve">Variable delay is assigned by assigning the </w:t>
+            </w:r>
+            <w:proofErr w:type="gramStart"/>
+            <w:r>
+              <w:rPr>
+                <w:rFonts w:ascii="Calibri" w:eastAsia="Calibri" w:hAnsi="Calibri" w:cs="Calibri"/>
+                <w:lang w:val="en-CA"/>
+              </w:rPr>
+              <w:t>msg.delay</w:t>
+            </w:r>
+            <w:proofErr w:type="gramEnd"/>
+            <w:r>
+              <w:rPr>
+                <w:rFonts w:ascii="Calibri" w:eastAsia="Calibri" w:hAnsi="Calibri" w:cs="Calibri"/>
+                <w:lang w:val="en-CA"/>
+              </w:rPr>
+              <w:t xml:space="preserve"> property using a change node.</w:t>
             </w:r>
           </w:p>
           <w:p>
@@ -2740,7 +2792,23 @@
                 <w:rFonts w:ascii="Calibri" w:eastAsia="Calibri" w:hAnsi="Calibri" w:cs="Calibri"/>
                 <w:lang w:val="en-CA"/>
               </w:rPr>
-              <w:t>The trigger block can be configured to send a hard coded value or values stored the in the msg, flow or global context.</w:t>
+              <w:t xml:space="preserve">The trigger block can be configured to send a hard coded </w:t>
+            </w:r>
+            <w:proofErr w:type="gramStart"/>
+            <w:r>
+              <w:rPr>
+                <w:rFonts w:ascii="Calibri" w:eastAsia="Calibri" w:hAnsi="Calibri" w:cs="Calibri"/>
+                <w:lang w:val="en-CA"/>
+              </w:rPr>
+              <w:t>value</w:t>
+            </w:r>
+            <w:proofErr w:type="gramEnd"/>
+            <w:r>
+              <w:rPr>
+                <w:rFonts w:ascii="Calibri" w:eastAsia="Calibri" w:hAnsi="Calibri" w:cs="Calibri"/>
+                <w:lang w:val="en-CA"/>
+              </w:rPr>
+              <w:t xml:space="preserve"> or values stored the in the msg, flow or global context.</w:t>
             </w:r>
           </w:p>
           <w:p>
@@ -2760,7 +2828,23 @@
                 <w:rFonts w:ascii="Calibri" w:eastAsia="Calibri" w:hAnsi="Calibri" w:cs="Calibri"/>
                 <w:lang w:val="en-CA"/>
               </w:rPr>
-              <w:t>It can also be configure to send a message after a certain amount of time passes.</w:t>
+              <w:t xml:space="preserve">It can also be </w:t>
+            </w:r>
+            <w:proofErr w:type="gramStart"/>
+            <w:r>
+              <w:rPr>
+                <w:rFonts w:ascii="Calibri" w:eastAsia="Calibri" w:hAnsi="Calibri" w:cs="Calibri"/>
+                <w:lang w:val="en-CA"/>
+              </w:rPr>
+              <w:t>configure</w:t>
+            </w:r>
+            <w:proofErr w:type="gramEnd"/>
+            <w:r>
+              <w:rPr>
+                <w:rFonts w:ascii="Calibri" w:eastAsia="Calibri" w:hAnsi="Calibri" w:cs="Calibri"/>
+                <w:lang w:val="en-CA"/>
+              </w:rPr>
+              <w:t xml:space="preserve"> to send a message after a certain amount of time passes.</w:t>
             </w:r>
           </w:p>
           <w:p>
@@ -2780,7 +2864,23 @@
                 <w:rFonts w:ascii="Calibri" w:eastAsia="Calibri" w:hAnsi="Calibri" w:cs="Calibri"/>
                 <w:lang w:val="en-CA"/>
               </w:rPr>
-              <w:t xml:space="preserve">Sending a msg object to this node with a msg.reset value </w:t>
+              <w:t xml:space="preserve">Sending a msg object to this node with a </w:t>
+            </w:r>
+            <w:proofErr w:type="gramStart"/>
+            <w:r>
+              <w:rPr>
+                <w:rFonts w:ascii="Calibri" w:eastAsia="Calibri" w:hAnsi="Calibri" w:cs="Calibri"/>
+                <w:lang w:val="en-CA"/>
+              </w:rPr>
+              <w:t>msg.reset</w:t>
+            </w:r>
+            <w:proofErr w:type="gramEnd"/>
+            <w:r>
+              <w:rPr>
+                <w:rFonts w:ascii="Calibri" w:eastAsia="Calibri" w:hAnsi="Calibri" w:cs="Calibri"/>
+                <w:lang w:val="en-CA"/>
+              </w:rPr>
+              <w:t xml:space="preserve"> value </w:t>
             </w:r>
             <w:r>
               <w:rPr>
@@ -2938,16 +3038,37 @@
                 <w:color w:val="000000" w:themeColor="text1"/>
                 <w:lang w:val="en-CA"/>
               </w:rPr>
-              <w:t>It will read the msg.payload that enters it, so change nodes will be used to easily set the</w:t>
-            </w:r>
-            <w:r>
-              <w:rPr>
+              <w:t>It will read the </w:t>
+            </w:r>
+            <w:proofErr w:type="gramStart"/>
+            <w:r>
+              <w:rPr>
+                <w:rStyle w:val="normaltextrun"/>
                 <w:rFonts w:ascii="Calibri" w:eastAsia="Calibri" w:hAnsi="Calibri" w:cs="Calibri"/>
                 <w:color w:val="000000" w:themeColor="text1"/>
                 <w:lang w:val="en-CA"/>
               </w:rPr>
+              <w:t>msg.payload</w:t>
+            </w:r>
+            <w:proofErr w:type="gramEnd"/>
+            <w:r>
+              <w:rPr>
+                <w:rStyle w:val="normaltextrun"/>
+                <w:rFonts w:ascii="Calibri" w:eastAsia="Calibri" w:hAnsi="Calibri" w:cs="Calibri"/>
+                <w:color w:val="000000" w:themeColor="text1"/>
+                <w:lang w:val="en-CA"/>
+              </w:rPr>
+              <w:t> that enters it, so change nodes will be used to easily set the</w:t>
+            </w:r>
+            <w:r>
+              <w:rPr>
+                <w:rFonts w:ascii="Calibri" w:eastAsia="Calibri" w:hAnsi="Calibri" w:cs="Calibri"/>
+                <w:color w:val="000000" w:themeColor="text1"/>
+                <w:lang w:val="en-CA"/>
+              </w:rPr>
               <w:t xml:space="preserve"> </w:t>
             </w:r>
+            <w:proofErr w:type="gramStart"/>
             <w:r>
               <w:rPr>
                 <w:rStyle w:val="normaltextrun"/>
@@ -2955,7 +3076,17 @@
                 <w:color w:val="000000" w:themeColor="text1"/>
                 <w:lang w:val="en-CA"/>
               </w:rPr>
-              <w:t>msg.payload. </w:t>
+              <w:t>msg.payload</w:t>
+            </w:r>
+            <w:proofErr w:type="gramEnd"/>
+            <w:r>
+              <w:rPr>
+                <w:rStyle w:val="normaltextrun"/>
+                <w:rFonts w:ascii="Calibri" w:eastAsia="Calibri" w:hAnsi="Calibri" w:cs="Calibri"/>
+                <w:color w:val="000000" w:themeColor="text1"/>
+                <w:lang w:val="en-CA"/>
+              </w:rPr>
+              <w:t>. </w:t>
             </w:r>
           </w:p>
         </w:tc>
@@ -3130,7 +3261,23 @@
                 <w:rFonts w:ascii="Calibri" w:eastAsia="Calibri" w:hAnsi="Calibri" w:cs="Calibri"/>
                 <w:lang w:val="en-CA"/>
               </w:rPr>
-              <w:t>Set value to msg.payload.</w:t>
+              <w:t xml:space="preserve">Set value to </w:t>
+            </w:r>
+            <w:proofErr w:type="gramStart"/>
+            <w:r>
+              <w:rPr>
+                <w:rFonts w:ascii="Calibri" w:eastAsia="Calibri" w:hAnsi="Calibri" w:cs="Calibri"/>
+                <w:lang w:val="en-CA"/>
+              </w:rPr>
+              <w:t>msg.payload</w:t>
+            </w:r>
+            <w:proofErr w:type="gramEnd"/>
+            <w:r>
+              <w:rPr>
+                <w:rFonts w:ascii="Calibri" w:eastAsia="Calibri" w:hAnsi="Calibri" w:cs="Calibri"/>
+                <w:lang w:val="en-CA"/>
+              </w:rPr>
+              <w:t>.</w:t>
             </w:r>
           </w:p>
           <w:p>
@@ -3845,7 +3992,25 @@
           <w:color w:val="000000" w:themeColor="text1"/>
           <w:lang w:val="en-US"/>
         </w:rPr>
-        <w:t xml:space="preserve">When opening the app, the screen below should automatically pop up.  </w:t>
+        <w:t xml:space="preserve">When opening the app, the screen </w:t>
+      </w:r>
+      <w:proofErr w:type="gramStart"/>
+      <w:r>
+        <w:rPr>
+          <w:rFonts w:ascii="Calibri" w:eastAsia="Calibri" w:hAnsi="Calibri" w:cs="Calibri"/>
+          <w:color w:val="000000" w:themeColor="text1"/>
+          <w:lang w:val="en-US"/>
+        </w:rPr>
+        <w:t>below should</w:t>
+      </w:r>
+      <w:proofErr w:type="gramEnd"/>
+      <w:r>
+        <w:rPr>
+          <w:rFonts w:ascii="Calibri" w:eastAsia="Calibri" w:hAnsi="Calibri" w:cs="Calibri"/>
+          <w:color w:val="000000" w:themeColor="text1"/>
+          <w:lang w:val="en-US"/>
+        </w:rPr>
+        <w:t xml:space="preserve"> automatically pop up.  </w:t>
       </w:r>
       <w:r>
         <w:rPr>
@@ -3969,27 +4134,6 @@
           <w:lang w:val="en-US"/>
         </w:rPr>
         <w:t xml:space="preserve">  </w:t>
-      </w:r>
-    </w:p>
-    <w:p>
-      <w:pPr>
-        <w:rPr>
-          <w:rFonts w:ascii="Calibri" w:eastAsia="Calibri" w:hAnsi="Calibri" w:cs="Calibri"/>
-          <w:color w:val="000000" w:themeColor="text1"/>
-          <w:sz w:val="28"/>
-          <w:szCs w:val="28"/>
-          <w:lang w:val="en-US"/>
-        </w:rPr>
-      </w:pPr>
-      <w:r>
-        <w:rPr>
-          <w:rFonts w:ascii="Calibri" w:eastAsia="Calibri" w:hAnsi="Calibri" w:cs="Calibri"/>
-          <w:color w:val="000000" w:themeColor="text1"/>
-          <w:sz w:val="28"/>
-          <w:szCs w:val="28"/>
-          <w:lang w:val="en-US"/>
-        </w:rPr>
-        <w:t>Barcode Solution</w:t>
       </w:r>
     </w:p>
     <w:p>

</xml_diff>